<commit_message>
Phase 02: Requirements document and user stories
</commit_message>
<xml_diff>
--- a/docs/phase-01-business-context/business-context.docx
+++ b/docs/phase-01-business-context/business-context.docx
@@ -63,12 +63,6 @@
         <w:gridCol w:w="7160"/>
       </w:tblGrid>
       <w:tr>
-        <w:tblPrEx>
-          <w:tblCellMar>
-            <w:top w:w="0" w:type="dxa"/>
-            <w:bottom w:w="0" w:type="dxa"/>
-          </w:tblCellMar>
-        </w:tblPrEx>
         <w:tc>
           <w:tcPr>
             <w:tcW w:w="2200" w:type="dxa"/>
@@ -158,12 +152,6 @@
         <w:gridCol w:w="7160"/>
       </w:tblGrid>
       <w:tr>
-        <w:tblPrEx>
-          <w:tblCellMar>
-            <w:top w:w="0" w:type="dxa"/>
-            <w:bottom w:w="0" w:type="dxa"/>
-          </w:tblCellMar>
-        </w:tblPrEx>
         <w:tc>
           <w:tcPr>
             <w:tcW w:w="2200" w:type="dxa"/>
@@ -250,12 +238,6 @@
         <w:gridCol w:w="7160"/>
       </w:tblGrid>
       <w:tr>
-        <w:tblPrEx>
-          <w:tblCellMar>
-            <w:top w:w="0" w:type="dxa"/>
-            <w:bottom w:w="0" w:type="dxa"/>
-          </w:tblCellMar>
-        </w:tblPrEx>
         <w:tc>
           <w:tcPr>
             <w:tcW w:w="2200" w:type="dxa"/>
@@ -342,12 +324,6 @@
         <w:gridCol w:w="7160"/>
       </w:tblGrid>
       <w:tr>
-        <w:tblPrEx>
-          <w:tblCellMar>
-            <w:top w:w="0" w:type="dxa"/>
-            <w:bottom w:w="0" w:type="dxa"/>
-          </w:tblCellMar>
-        </w:tblPrEx>
         <w:tc>
           <w:tcPr>
             <w:tcW w:w="2200" w:type="dxa"/>
@@ -434,12 +410,6 @@
         <w:gridCol w:w="7160"/>
       </w:tblGrid>
       <w:tr>
-        <w:tblPrEx>
-          <w:tblCellMar>
-            <w:top w:w="0" w:type="dxa"/>
-            <w:bottom w:w="0" w:type="dxa"/>
-          </w:tblCellMar>
-        </w:tblPrEx>
         <w:tc>
           <w:tcPr>
             <w:tcW w:w="2200" w:type="dxa"/>
@@ -526,12 +496,6 @@
         <w:gridCol w:w="7160"/>
       </w:tblGrid>
       <w:tr>
-        <w:tblPrEx>
-          <w:tblCellMar>
-            <w:top w:w="0" w:type="dxa"/>
-            <w:bottom w:w="0" w:type="dxa"/>
-          </w:tblCellMar>
-        </w:tblPrEx>
         <w:tc>
           <w:tcPr>
             <w:tcW w:w="2200" w:type="dxa"/>
@@ -617,56 +581,48 @@
         </w:rPr>
         <w:t xml:space="preserve">Urban car parking is an </w:t>
       </w:r>
-      <w:proofErr w:type="spellStart"/>
-      <w:r>
-        <w:rPr>
-          <w:color w:val="404040"/>
-        </w:rPr>
-        <w:t>underdigitised</w:t>
-      </w:r>
-      <w:proofErr w:type="spellEnd"/>
+      <w:r>
+        <w:rPr>
+          <w:color w:val="404040"/>
+        </w:rPr>
+        <w:t>interdigitated</w:t>
+      </w:r>
       <w:r>
         <w:rPr>
           <w:color w:val="404040"/>
         </w:rPr>
         <w:t xml:space="preserve"> operation. </w:t>
       </w:r>
-      <w:proofErr w:type="gramStart"/>
-      <w:r>
-        <w:rPr>
-          <w:color w:val="404040"/>
-        </w:rPr>
-        <w:t>The majority of</w:t>
-      </w:r>
-      <w:proofErr w:type="gramEnd"/>
+      <w:r>
+        <w:rPr>
+          <w:color w:val="404040"/>
+        </w:rPr>
+        <w:t>Most</w:t>
+      </w:r>
       <w:r>
         <w:rPr>
           <w:color w:val="404040"/>
         </w:rPr>
         <w:t xml:space="preserve"> municipal and private car parks in Sri Lanka and across the region still rely on manual ticketing, cash collection, and paper-based record keeping. This creates compounding problems: revenue leakage, poor </w:t>
       </w:r>
-      <w:proofErr w:type="spellStart"/>
-      <w:r>
-        <w:rPr>
-          <w:color w:val="404040"/>
-        </w:rPr>
-        <w:t>utilisation</w:t>
-      </w:r>
-      <w:proofErr w:type="spellEnd"/>
+      <w:r>
+        <w:rPr>
+          <w:color w:val="404040"/>
+        </w:rPr>
+        <w:t>utilization</w:t>
+      </w:r>
       <w:r>
         <w:rPr>
           <w:color w:val="404040"/>
         </w:rPr>
         <w:t xml:space="preserve"> data, high operational </w:t>
       </w:r>
-      <w:proofErr w:type="spellStart"/>
-      <w:r>
-        <w:rPr>
-          <w:color w:val="404040"/>
-        </w:rPr>
-        <w:t>labour</w:t>
-      </w:r>
-      <w:proofErr w:type="spellEnd"/>
+      <w:r>
+        <w:rPr>
+          <w:color w:val="404040"/>
+        </w:rPr>
+        <w:t>labor</w:t>
+      </w:r>
       <w:r>
         <w:rPr>
           <w:color w:val="404040"/>
@@ -705,6 +661,16 @@
         </w:rPr>
         <w:t>This document is the foundation for all subsequent BA deliverables in this portfolio. Every requirement, user story, process model, and design decision made in later phases should be traceable back to the objectives defined here.</w:t>
       </w:r>
+    </w:p>
+    <w:p>
+      <w:pPr>
+        <w:spacing w:before="120"/>
+      </w:pPr>
+    </w:p>
+    <w:p>
+      <w:pPr>
+        <w:spacing w:before="120"/>
+      </w:pPr>
     </w:p>
     <w:p>
       <w:pPr>
@@ -719,6 +685,7 @@
         </w:pBdr>
       </w:pPr>
       <w:r>
+        <w:lastRenderedPageBreak/>
         <w:t>2. Problem Statement</w:t>
       </w:r>
     </w:p>
@@ -727,7 +694,6 @@
         <w:pStyle w:val="Heading2"/>
       </w:pPr>
       <w:r>
-        <w:lastRenderedPageBreak/>
         <w:t>2.1 Current Situation</w:t>
       </w:r>
     </w:p>
@@ -741,14 +707,12 @@
         </w:rPr>
         <w:t xml:space="preserve">The target </w:t>
       </w:r>
-      <w:proofErr w:type="spellStart"/>
-      <w:r>
-        <w:rPr>
-          <w:color w:val="404040"/>
-        </w:rPr>
-        <w:t>organisation</w:t>
-      </w:r>
-      <w:proofErr w:type="spellEnd"/>
+      <w:r>
+        <w:rPr>
+          <w:color w:val="404040"/>
+        </w:rPr>
+        <w:t>organization</w:t>
+      </w:r>
       <w:r>
         <w:rPr>
           <w:color w:val="404040"/>
@@ -792,12 +756,6 @@
         <w:gridCol w:w="1760"/>
       </w:tblGrid>
       <w:tr>
-        <w:tblPrEx>
-          <w:tblCellMar>
-            <w:top w:w="0" w:type="dxa"/>
-            <w:bottom w:w="0" w:type="dxa"/>
-          </w:tblCellMar>
-        </w:tblPrEx>
         <w:tc>
           <w:tcPr>
             <w:tcW w:w="3600" w:type="dxa"/>
@@ -890,12 +848,6 @@
         </w:tc>
       </w:tr>
       <w:tr>
-        <w:tblPrEx>
-          <w:tblCellMar>
-            <w:top w:w="0" w:type="dxa"/>
-            <w:bottom w:w="0" w:type="dxa"/>
-          </w:tblCellMar>
-        </w:tblPrEx>
         <w:tc>
           <w:tcPr>
             <w:tcW w:w="3600" w:type="dxa"/>
@@ -982,12 +934,6 @@
         </w:tc>
       </w:tr>
       <w:tr>
-        <w:tblPrEx>
-          <w:tblCellMar>
-            <w:top w:w="0" w:type="dxa"/>
-            <w:bottom w:w="0" w:type="dxa"/>
-          </w:tblCellMar>
-        </w:tblPrEx>
         <w:tc>
           <w:tcPr>
             <w:tcW w:w="3600" w:type="dxa"/>
@@ -1074,12 +1020,6 @@
         </w:tc>
       </w:tr>
       <w:tr>
-        <w:tblPrEx>
-          <w:tblCellMar>
-            <w:top w:w="0" w:type="dxa"/>
-            <w:bottom w:w="0" w:type="dxa"/>
-          </w:tblCellMar>
-        </w:tblPrEx>
         <w:tc>
           <w:tcPr>
             <w:tcW w:w="3600" w:type="dxa"/>
@@ -1166,12 +1106,6 @@
         </w:tc>
       </w:tr>
       <w:tr>
-        <w:tblPrEx>
-          <w:tblCellMar>
-            <w:top w:w="0" w:type="dxa"/>
-            <w:bottom w:w="0" w:type="dxa"/>
-          </w:tblCellMar>
-        </w:tblPrEx>
         <w:tc>
           <w:tcPr>
             <w:tcW w:w="3600" w:type="dxa"/>
@@ -1226,16 +1160,14 @@
               </w:rPr>
               <w:t xml:space="preserve">The facility cannot serve corporate accounts or </w:t>
             </w:r>
-            <w:proofErr w:type="gramStart"/>
-            <w:r>
-              <w:rPr>
-                <w:color w:val="404040"/>
-                <w:sz w:val="20"/>
-                <w:szCs w:val="20"/>
-              </w:rPr>
-              <w:t>event</w:t>
-            </w:r>
-            <w:proofErr w:type="gramEnd"/>
+            <w:r>
+              <w:rPr>
+                <w:color w:val="404040"/>
+                <w:sz w:val="20"/>
+                <w:szCs w:val="20"/>
+              </w:rPr>
+              <w:t>even</w:t>
+            </w:r>
             <w:r>
               <w:rPr>
                 <w:color w:val="404040"/>
@@ -1276,12 +1208,6 @@
         </w:tc>
       </w:tr>
       <w:tr>
-        <w:tblPrEx>
-          <w:tblCellMar>
-            <w:top w:w="0" w:type="dxa"/>
-            <w:bottom w:w="0" w:type="dxa"/>
-          </w:tblCellMar>
-        </w:tblPrEx>
         <w:tc>
           <w:tcPr>
             <w:tcW w:w="3600" w:type="dxa"/>
@@ -1308,16 +1234,14 @@
               </w:rPr>
               <w:t xml:space="preserve">High </w:t>
             </w:r>
-            <w:proofErr w:type="spellStart"/>
-            <w:r>
-              <w:rPr>
-                <w:color w:val="404040"/>
-                <w:sz w:val="20"/>
-                <w:szCs w:val="20"/>
-              </w:rPr>
-              <w:t>labour</w:t>
-            </w:r>
-            <w:proofErr w:type="spellEnd"/>
+            <w:r>
+              <w:rPr>
+                <w:color w:val="404040"/>
+                <w:sz w:val="20"/>
+                <w:szCs w:val="20"/>
+              </w:rPr>
+              <w:t>labor</w:t>
+            </w:r>
             <w:r>
               <w:rPr>
                 <w:color w:val="404040"/>
@@ -1386,12 +1310,6 @@
         </w:tc>
       </w:tr>
       <w:tr>
-        <w:tblPrEx>
-          <w:tblCellMar>
-            <w:top w:w="0" w:type="dxa"/>
-            <w:bottom w:w="0" w:type="dxa"/>
-          </w:tblCellMar>
-        </w:tblPrEx>
         <w:tc>
           <w:tcPr>
             <w:tcW w:w="3600" w:type="dxa"/>
@@ -1570,20 +1488,28 @@
         </w:rPr>
         <w:t xml:space="preserve">Estimated </w:t>
       </w:r>
-      <w:proofErr w:type="spellStart"/>
-      <w:r>
-        <w:rPr>
-          <w:color w:val="404040"/>
-        </w:rPr>
-        <w:t>labour</w:t>
-      </w:r>
-      <w:proofErr w:type="spellEnd"/>
+      <w:r>
+        <w:rPr>
+          <w:color w:val="404040"/>
+        </w:rPr>
+        <w:t>labor</w:t>
+      </w:r>
       <w:r>
         <w:rPr>
           <w:color w:val="404040"/>
         </w:rPr>
         <w:t xml:space="preserve"> cost savings from partial automation: LKR 4,800,000/year</w:t>
       </w:r>
+    </w:p>
+    <w:p>
+      <w:pPr>
+        <w:spacing w:before="120"/>
+      </w:pPr>
+    </w:p>
+    <w:p>
+      <w:pPr>
+        <w:spacing w:before="120"/>
+      </w:pPr>
     </w:p>
     <w:p>
       <w:pPr>
@@ -1603,6 +1529,7 @@
         </w:pBdr>
       </w:pPr>
       <w:r>
+        <w:lastRenderedPageBreak/>
         <w:t>3. Business Objectives</w:t>
       </w:r>
     </w:p>
@@ -1646,12 +1573,6 @@
         <w:gridCol w:w="1860"/>
       </w:tblGrid>
       <w:tr>
-        <w:tblPrEx>
-          <w:tblCellMar>
-            <w:top w:w="0" w:type="dxa"/>
-            <w:bottom w:w="0" w:type="dxa"/>
-          </w:tblCellMar>
-        </w:tblPrEx>
         <w:tc>
           <w:tcPr>
             <w:tcW w:w="900" w:type="dxa"/>
@@ -1678,7 +1599,6 @@
                 <w:sz w:val="20"/>
                 <w:szCs w:val="20"/>
               </w:rPr>
-              <w:lastRenderedPageBreak/>
               <w:t>Ref</w:t>
             </w:r>
           </w:p>
@@ -1775,12 +1695,6 @@
         </w:tc>
       </w:tr>
       <w:tr>
-        <w:tblPrEx>
-          <w:tblCellMar>
-            <w:top w:w="0" w:type="dxa"/>
-            <w:bottom w:w="0" w:type="dxa"/>
-          </w:tblCellMar>
-        </w:tblPrEx>
         <w:tc>
           <w:tcPr>
             <w:tcW w:w="900" w:type="dxa"/>
@@ -1863,16 +1777,14 @@
               </w:rPr>
               <w:t xml:space="preserve">100% of transactions </w:t>
             </w:r>
-            <w:proofErr w:type="gramStart"/>
-            <w:r>
-              <w:rPr>
-                <w:color w:val="404040"/>
-                <w:sz w:val="20"/>
-                <w:szCs w:val="20"/>
-              </w:rPr>
-              <w:t>processed</w:t>
-            </w:r>
-            <w:proofErr w:type="gramEnd"/>
+            <w:r>
+              <w:rPr>
+                <w:color w:val="404040"/>
+                <w:sz w:val="20"/>
+                <w:szCs w:val="20"/>
+              </w:rPr>
+              <w:t>are processed</w:t>
+            </w:r>
             <w:r>
               <w:rPr>
                 <w:color w:val="404040"/>
@@ -1913,12 +1825,6 @@
         </w:tc>
       </w:tr>
       <w:tr>
-        <w:tblPrEx>
-          <w:tblCellMar>
-            <w:top w:w="0" w:type="dxa"/>
-            <w:bottom w:w="0" w:type="dxa"/>
-          </w:tblCellMar>
-        </w:tblPrEx>
         <w:tc>
           <w:tcPr>
             <w:tcW w:w="900" w:type="dxa"/>
@@ -2033,12 +1939,6 @@
         </w:tc>
       </w:tr>
       <w:tr>
-        <w:tblPrEx>
-          <w:tblCellMar>
-            <w:top w:w="0" w:type="dxa"/>
-            <w:bottom w:w="0" w:type="dxa"/>
-          </w:tblCellMar>
-        </w:tblPrEx>
         <w:tc>
           <w:tcPr>
             <w:tcW w:w="900" w:type="dxa"/>
@@ -2153,12 +2053,6 @@
         </w:tc>
       </w:tr>
       <w:tr>
-        <w:tblPrEx>
-          <w:tblCellMar>
-            <w:top w:w="0" w:type="dxa"/>
-            <w:bottom w:w="0" w:type="dxa"/>
-          </w:tblCellMar>
-        </w:tblPrEx>
         <w:tc>
           <w:tcPr>
             <w:tcW w:w="900" w:type="dxa"/>
@@ -2273,12 +2167,6 @@
         </w:tc>
       </w:tr>
       <w:tr>
-        <w:tblPrEx>
-          <w:tblCellMar>
-            <w:top w:w="0" w:type="dxa"/>
-            <w:bottom w:w="0" w:type="dxa"/>
-          </w:tblCellMar>
-        </w:tblPrEx>
         <w:tc>
           <w:tcPr>
             <w:tcW w:w="900" w:type="dxa"/>
@@ -2393,12 +2281,6 @@
         </w:tc>
       </w:tr>
       <w:tr>
-        <w:tblPrEx>
-          <w:tblCellMar>
-            <w:top w:w="0" w:type="dxa"/>
-            <w:bottom w:w="0" w:type="dxa"/>
-          </w:tblCellMar>
-        </w:tblPrEx>
         <w:tc>
           <w:tcPr>
             <w:tcW w:w="900" w:type="dxa"/>
@@ -2723,6 +2605,7 @@
         <w:rPr>
           <w:color w:val="404040"/>
         </w:rPr>
+        <w:lastRenderedPageBreak/>
         <w:t>Pre-booking and reservation module (captured as future phase — OBJ-05)</w:t>
       </w:r>
     </w:p>
@@ -2866,14 +2749,12 @@
         </w:rPr>
         <w:t xml:space="preserve">The </w:t>
       </w:r>
-      <w:proofErr w:type="spellStart"/>
-      <w:r>
-        <w:rPr>
-          <w:color w:val="404040"/>
-        </w:rPr>
-        <w:t>organisation</w:t>
-      </w:r>
-      <w:proofErr w:type="spellEnd"/>
+      <w:r>
+        <w:rPr>
+          <w:color w:val="404040"/>
+        </w:rPr>
+        <w:t>organization</w:t>
+      </w:r>
       <w:r>
         <w:rPr>
           <w:color w:val="404040"/>
@@ -2919,14 +2800,12 @@
         </w:numPr>
         <w:spacing w:before="40" w:after="40"/>
       </w:pPr>
-      <w:proofErr w:type="gramStart"/>
-      <w:r>
-        <w:rPr>
-          <w:color w:val="404040"/>
-        </w:rPr>
-        <w:t>Prototype</w:t>
-      </w:r>
-      <w:proofErr w:type="gramEnd"/>
+      <w:r>
+        <w:rPr>
+          <w:color w:val="404040"/>
+        </w:rPr>
+        <w:t>Prototypes</w:t>
+      </w:r>
       <w:r>
         <w:rPr>
           <w:color w:val="404040"/>
@@ -3008,14 +2887,12 @@
         </w:rPr>
         <w:t xml:space="preserve">The engagement will be considered successful when </w:t>
       </w:r>
-      <w:proofErr w:type="gramStart"/>
-      <w:r>
-        <w:rPr>
-          <w:color w:val="404040"/>
-        </w:rPr>
-        <w:t>all of</w:t>
-      </w:r>
-      <w:proofErr w:type="gramEnd"/>
+      <w:r>
+        <w:rPr>
+          <w:color w:val="404040"/>
+        </w:rPr>
+        <w:t>all</w:t>
+      </w:r>
       <w:r>
         <w:rPr>
           <w:color w:val="404040"/>
@@ -3146,12 +3023,6 @@
         <w:gridCol w:w="7360"/>
       </w:tblGrid>
       <w:tr>
-        <w:tblPrEx>
-          <w:tblCellMar>
-            <w:top w:w="0" w:type="dxa"/>
-            <w:bottom w:w="0" w:type="dxa"/>
-          </w:tblCellMar>
-        </w:tblPrEx>
         <w:tc>
           <w:tcPr>
             <w:tcW w:w="2000" w:type="dxa"/>
@@ -3214,12 +3085,6 @@
         </w:tc>
       </w:tr>
       <w:tr>
-        <w:tblPrEx>
-          <w:tblCellMar>
-            <w:top w:w="0" w:type="dxa"/>
-            <w:bottom w:w="0" w:type="dxa"/>
-          </w:tblCellMar>
-        </w:tblPrEx>
         <w:tc>
           <w:tcPr>
             <w:tcW w:w="2000" w:type="dxa"/>
@@ -3278,12 +3143,6 @@
         </w:tc>
       </w:tr>
       <w:tr>
-        <w:tblPrEx>
-          <w:tblCellMar>
-            <w:top w:w="0" w:type="dxa"/>
-            <w:bottom w:w="0" w:type="dxa"/>
-          </w:tblCellMar>
-        </w:tblPrEx>
         <w:tc>
           <w:tcPr>
             <w:tcW w:w="2000" w:type="dxa"/>
@@ -3308,6 +3167,7 @@
                 <w:sz w:val="20"/>
                 <w:szCs w:val="20"/>
               </w:rPr>
+              <w:lastRenderedPageBreak/>
               <w:t>BPMN</w:t>
             </w:r>
           </w:p>
@@ -3342,12 +3202,6 @@
         </w:tc>
       </w:tr>
       <w:tr>
-        <w:tblPrEx>
-          <w:tblCellMar>
-            <w:top w:w="0" w:type="dxa"/>
-            <w:bottom w:w="0" w:type="dxa"/>
-          </w:tblCellMar>
-        </w:tblPrEx>
         <w:tc>
           <w:tcPr>
             <w:tcW w:w="2000" w:type="dxa"/>
@@ -3372,7 +3226,6 @@
                 <w:sz w:val="20"/>
                 <w:szCs w:val="20"/>
               </w:rPr>
-              <w:lastRenderedPageBreak/>
               <w:t>Check-in</w:t>
             </w:r>
           </w:p>
@@ -3407,12 +3260,6 @@
         </w:tc>
       </w:tr>
       <w:tr>
-        <w:tblPrEx>
-          <w:tblCellMar>
-            <w:top w:w="0" w:type="dxa"/>
-            <w:bottom w:w="0" w:type="dxa"/>
-          </w:tblCellMar>
-        </w:tblPrEx>
         <w:tc>
           <w:tcPr>
             <w:tcW w:w="2000" w:type="dxa"/>
@@ -3471,12 +3318,6 @@
         </w:tc>
       </w:tr>
       <w:tr>
-        <w:tblPrEx>
-          <w:tblCellMar>
-            <w:top w:w="0" w:type="dxa"/>
-            <w:bottom w:w="0" w:type="dxa"/>
-          </w:tblCellMar>
-        </w:tblPrEx>
         <w:tc>
           <w:tcPr>
             <w:tcW w:w="2000" w:type="dxa"/>
@@ -3535,12 +3376,6 @@
         </w:tc>
       </w:tr>
       <w:tr>
-        <w:tblPrEx>
-          <w:tblCellMar>
-            <w:top w:w="0" w:type="dxa"/>
-            <w:bottom w:w="0" w:type="dxa"/>
-          </w:tblCellMar>
-        </w:tblPrEx>
         <w:tc>
           <w:tcPr>
             <w:tcW w:w="2000" w:type="dxa"/>
@@ -3599,12 +3434,6 @@
         </w:tc>
       </w:tr>
       <w:tr>
-        <w:tblPrEx>
-          <w:tblCellMar>
-            <w:top w:w="0" w:type="dxa"/>
-            <w:bottom w:w="0" w:type="dxa"/>
-          </w:tblCellMar>
-        </w:tblPrEx>
         <w:tc>
           <w:tcPr>
             <w:tcW w:w="2000" w:type="dxa"/>
@@ -3659,34 +3488,42 @@
               </w:rPr>
               <w:t xml:space="preserve">The </w:t>
             </w:r>
-            <w:proofErr w:type="gramStart"/>
-            <w:r>
-              <w:rPr>
-                <w:color w:val="404040"/>
-                <w:sz w:val="20"/>
-                <w:szCs w:val="20"/>
-              </w:rPr>
-              <w:t>current status</w:t>
-            </w:r>
-            <w:proofErr w:type="gramEnd"/>
-            <w:r>
-              <w:rPr>
-                <w:color w:val="404040"/>
-                <w:sz w:val="20"/>
-                <w:szCs w:val="20"/>
-              </w:rPr>
-              <w:t xml:space="preserve"> of a parking space: Available, Occupied, Reserved, or Maintenance</w:t>
+            <w:r>
+              <w:rPr>
+                <w:color w:val="404040"/>
+                <w:sz w:val="20"/>
+                <w:szCs w:val="20"/>
+              </w:rPr>
+              <w:t>status</w:t>
+            </w:r>
+            <w:r>
+              <w:rPr>
+                <w:color w:val="404040"/>
+                <w:sz w:val="20"/>
+                <w:szCs w:val="20"/>
+              </w:rPr>
+              <w:t xml:space="preserve"> of </w:t>
+            </w:r>
+            <w:r>
+              <w:rPr>
+                <w:color w:val="404040"/>
+                <w:sz w:val="20"/>
+                <w:szCs w:val="20"/>
+              </w:rPr>
+              <w:t>parking</w:t>
+            </w:r>
+            <w:r>
+              <w:rPr>
+                <w:color w:val="404040"/>
+                <w:sz w:val="20"/>
+                <w:szCs w:val="20"/>
+              </w:rPr>
+              <w:t xml:space="preserve"> space: Available, Occupied, Reserved, or Maintenance</w:t>
             </w:r>
           </w:p>
         </w:tc>
       </w:tr>
       <w:tr>
-        <w:tblPrEx>
-          <w:tblCellMar>
-            <w:top w:w="0" w:type="dxa"/>
-            <w:bottom w:w="0" w:type="dxa"/>
-          </w:tblCellMar>
-        </w:tblPrEx>
         <w:tc>
           <w:tcPr>
             <w:tcW w:w="2000" w:type="dxa"/>
@@ -3745,12 +3582,6 @@
         </w:tc>
       </w:tr>
       <w:tr>
-        <w:tblPrEx>
-          <w:tblCellMar>
-            <w:top w:w="0" w:type="dxa"/>
-            <w:bottom w:w="0" w:type="dxa"/>
-          </w:tblCellMar>
-        </w:tblPrEx>
         <w:tc>
           <w:tcPr>
             <w:tcW w:w="2000" w:type="dxa"/>
@@ -3844,6 +3675,7 @@
     <w:tbl>
       <w:tblPr>
         <w:tblW w:w="9360" w:type="dxa"/>
+        <w:jc w:val="center"/>
         <w:tblBorders>
           <w:top w:val="single" w:sz="4" w:space="0" w:color="auto"/>
           <w:left w:val="single" w:sz="4" w:space="0" w:color="auto"/>
@@ -3865,12 +3697,9 @@
         <w:gridCol w:w="2340"/>
       </w:tblGrid>
       <w:tr>
-        <w:tblPrEx>
-          <w:tblCellMar>
-            <w:top w:w="0" w:type="dxa"/>
-            <w:bottom w:w="0" w:type="dxa"/>
-          </w:tblCellMar>
-        </w:tblPrEx>
+        <w:trPr>
+          <w:jc w:val="center"/>
+        </w:trPr>
         <w:tc>
           <w:tcPr>
             <w:tcW w:w="2340" w:type="dxa"/>
@@ -3889,6 +3718,9 @@
             </w:tcMar>
           </w:tcPr>
           <w:p>
+            <w:pPr>
+              <w:jc w:val="center"/>
+            </w:pPr>
             <w:r>
               <w:rPr>
                 <w:b/>
@@ -3919,6 +3751,9 @@
             </w:tcMar>
           </w:tcPr>
           <w:p>
+            <w:pPr>
+              <w:jc w:val="center"/>
+            </w:pPr>
             <w:r>
               <w:rPr>
                 <w:b/>
@@ -3949,6 +3784,9 @@
             </w:tcMar>
           </w:tcPr>
           <w:p>
+            <w:pPr>
+              <w:jc w:val="center"/>
+            </w:pPr>
             <w:r>
               <w:rPr>
                 <w:b/>
@@ -3979,6 +3817,9 @@
             </w:tcMar>
           </w:tcPr>
           <w:p>
+            <w:pPr>
+              <w:jc w:val="center"/>
+            </w:pPr>
             <w:r>
               <w:rPr>
                 <w:b/>
@@ -3993,12 +3834,9 @@
         </w:tc>
       </w:tr>
       <w:tr>
-        <w:tblPrEx>
-          <w:tblCellMar>
-            <w:top w:w="0" w:type="dxa"/>
-            <w:bottom w:w="0" w:type="dxa"/>
-          </w:tblCellMar>
-        </w:tblPrEx>
+        <w:trPr>
+          <w:jc w:val="center"/>
+        </w:trPr>
         <w:tc>
           <w:tcPr>
             <w:tcW w:w="2340" w:type="dxa"/>
@@ -4017,6 +3855,9 @@
             </w:tcMar>
           </w:tcPr>
           <w:p>
+            <w:pPr>
+              <w:jc w:val="center"/>
+            </w:pPr>
             <w:r>
               <w:rPr>
                 <w:color w:val="404040"/>
@@ -4045,8 +3886,11 @@
             </w:tcMar>
           </w:tcPr>
           <w:p>
-            <w:r>
-              <w:t xml:space="preserve">Surya Umashankar </w:t>
+            <w:pPr>
+              <w:jc w:val="center"/>
+            </w:pPr>
+            <w:r>
+              <w:t>Surya Umashankar</w:t>
             </w:r>
           </w:p>
         </w:tc>
@@ -4067,7 +3911,14 @@
               <w:right w:w="120" w:type="dxa"/>
             </w:tcMar>
           </w:tcPr>
-          <w:p/>
+          <w:p>
+            <w:pPr>
+              <w:jc w:val="center"/>
+            </w:pPr>
+            <w:r>
+              <w:t>Surya Umashankar</w:t>
+            </w:r>
+          </w:p>
         </w:tc>
         <w:tc>
           <w:tcPr>
@@ -4087,6 +3938,9 @@
             </w:tcMar>
           </w:tcPr>
           <w:p>
+            <w:pPr>
+              <w:jc w:val="center"/>
+            </w:pPr>
             <w:r>
               <w:rPr>
                 <w:color w:val="404040"/>
@@ -4099,12 +3953,9 @@
         </w:tc>
       </w:tr>
       <w:tr>
-        <w:tblPrEx>
-          <w:tblCellMar>
-            <w:top w:w="0" w:type="dxa"/>
-            <w:bottom w:w="0" w:type="dxa"/>
-          </w:tblCellMar>
-        </w:tblPrEx>
+        <w:trPr>
+          <w:jc w:val="center"/>
+        </w:trPr>
         <w:tc>
           <w:tcPr>
             <w:tcW w:w="2340" w:type="dxa"/>
@@ -4123,6 +3974,9 @@
             </w:tcMar>
           </w:tcPr>
           <w:p>
+            <w:pPr>
+              <w:jc w:val="center"/>
+            </w:pPr>
             <w:r>
               <w:rPr>
                 <w:color w:val="404040"/>
@@ -4151,13 +4005,11 @@
             </w:tcMar>
           </w:tcPr>
           <w:p>
-            <w:r>
-              <w:rPr>
-                <w:color w:val="404040"/>
-                <w:sz w:val="20"/>
-                <w:szCs w:val="20"/>
-              </w:rPr>
-              <w:t>[Sponsor Name]</w:t>
+            <w:pPr>
+              <w:jc w:val="center"/>
+            </w:pPr>
+            <w:r>
+              <w:t>-----</w:t>
             </w:r>
           </w:p>
         </w:tc>
@@ -4178,7 +4030,14 @@
               <w:right w:w="120" w:type="dxa"/>
             </w:tcMar>
           </w:tcPr>
-          <w:p/>
+          <w:p>
+            <w:pPr>
+              <w:jc w:val="center"/>
+            </w:pPr>
+            <w:r>
+              <w:t>-----</w:t>
+            </w:r>
+          </w:p>
         </w:tc>
         <w:tc>
           <w:tcPr>
@@ -4197,16 +4056,21 @@
               <w:right w:w="120" w:type="dxa"/>
             </w:tcMar>
           </w:tcPr>
-          <w:p/>
+          <w:p>
+            <w:pPr>
+              <w:jc w:val="center"/>
+            </w:pPr>
+            <w:r>
+              <w:t>-----</w:t>
+            </w:r>
+          </w:p>
         </w:tc>
       </w:tr>
       <w:tr>
-        <w:tblPrEx>
-          <w:tblCellMar>
-            <w:top w:w="0" w:type="dxa"/>
-            <w:bottom w:w="0" w:type="dxa"/>
-          </w:tblCellMar>
-        </w:tblPrEx>
+        <w:trPr>
+          <w:trHeight w:val="377"/>
+          <w:jc w:val="center"/>
+        </w:trPr>
         <w:tc>
           <w:tcPr>
             <w:tcW w:w="2340" w:type="dxa"/>
@@ -4225,6 +4089,9 @@
             </w:tcMar>
           </w:tcPr>
           <w:p>
+            <w:pPr>
+              <w:jc w:val="center"/>
+            </w:pPr>
             <w:r>
               <w:rPr>
                 <w:color w:val="404040"/>
@@ -4253,13 +4120,11 @@
             </w:tcMar>
           </w:tcPr>
           <w:p>
-            <w:r>
-              <w:rPr>
-                <w:color w:val="404040"/>
-                <w:sz w:val="20"/>
-                <w:szCs w:val="20"/>
-              </w:rPr>
-              <w:t>[Owner Name]</w:t>
+            <w:pPr>
+              <w:jc w:val="center"/>
+            </w:pPr>
+            <w:r>
+              <w:t>-----</w:t>
             </w:r>
           </w:p>
         </w:tc>
@@ -4280,7 +4145,14 @@
               <w:right w:w="120" w:type="dxa"/>
             </w:tcMar>
           </w:tcPr>
-          <w:p/>
+          <w:p>
+            <w:pPr>
+              <w:jc w:val="center"/>
+            </w:pPr>
+            <w:r>
+              <w:t>-----</w:t>
+            </w:r>
+          </w:p>
         </w:tc>
         <w:tc>
           <w:tcPr>
@@ -4299,7 +4171,14 @@
               <w:right w:w="120" w:type="dxa"/>
             </w:tcMar>
           </w:tcPr>
-          <w:p/>
+          <w:p>
+            <w:pPr>
+              <w:jc w:val="center"/>
+            </w:pPr>
+            <w:r>
+              <w:t>-----</w:t>
+            </w:r>
+          </w:p>
         </w:tc>
       </w:tr>
     </w:tbl>
@@ -4404,32 +4283,21 @@
       </w:rPr>
       <w:t xml:space="preserve">Smart Parking </w:t>
     </w:r>
-    <w:proofErr w:type="gramStart"/>
     <w:r>
       <w:rPr>
         <w:color w:val="888888"/>
         <w:sz w:val="18"/>
         <w:szCs w:val="18"/>
       </w:rPr>
-      <w:t>System  |</w:t>
+      <w:t>System |</w:t>
     </w:r>
-    <w:proofErr w:type="gramEnd"/>
     <w:r>
       <w:rPr>
         <w:color w:val="888888"/>
         <w:sz w:val="18"/>
         <w:szCs w:val="18"/>
       </w:rPr>
-      <w:t xml:space="preserve">  Business Analysis </w:t>
-    </w:r>
-    <w:proofErr w:type="gramStart"/>
-    <w:r>
-      <w:rPr>
-        <w:color w:val="888888"/>
-        <w:sz w:val="18"/>
-        <w:szCs w:val="18"/>
-      </w:rPr>
-      <w:t>Portfolio</w:t>
+      <w:t xml:space="preserve"> Business Analysis Portfolio</w:t>
     </w:r>
     <w:r>
       <w:rPr>
@@ -4437,16 +4305,7 @@
         <w:sz w:val="18"/>
         <w:szCs w:val="18"/>
       </w:rPr>
-      <w:t xml:space="preserve">  |</w:t>
-    </w:r>
-    <w:proofErr w:type="gramEnd"/>
-    <w:r>
-      <w:rPr>
-        <w:color w:val="2E75B6"/>
-        <w:sz w:val="18"/>
-        <w:szCs w:val="18"/>
-      </w:rPr>
-      <w:t xml:space="preserve">  Phase 01 — Business Context</w:t>
+      <w:t xml:space="preserve"> | Phase 01 — Business Context</w:t>
     </w:r>
   </w:p>
 </w:hdr>
@@ -5212,6 +5071,48 @@
       <w:szCs w:val="20"/>
     </w:rPr>
   </w:style>
+  <w:style w:type="paragraph" w:styleId="Header">
+    <w:name w:val="header"/>
+    <w:basedOn w:val="Normal"/>
+    <w:link w:val="HeaderChar"/>
+    <w:uiPriority w:val="99"/>
+    <w:unhideWhenUsed/>
+    <w:rsid w:val="004A4202"/>
+    <w:pPr>
+      <w:tabs>
+        <w:tab w:val="center" w:pos="4680"/>
+        <w:tab w:val="right" w:pos="9360"/>
+      </w:tabs>
+    </w:pPr>
+  </w:style>
+  <w:style w:type="character" w:customStyle="1" w:styleId="HeaderChar">
+    <w:name w:val="Header Char"/>
+    <w:basedOn w:val="DefaultParagraphFont"/>
+    <w:link w:val="Header"/>
+    <w:uiPriority w:val="99"/>
+    <w:rsid w:val="004A4202"/>
+  </w:style>
+  <w:style w:type="paragraph" w:styleId="Footer">
+    <w:name w:val="footer"/>
+    <w:basedOn w:val="Normal"/>
+    <w:link w:val="FooterChar"/>
+    <w:uiPriority w:val="99"/>
+    <w:unhideWhenUsed/>
+    <w:rsid w:val="004A4202"/>
+    <w:pPr>
+      <w:tabs>
+        <w:tab w:val="center" w:pos="4680"/>
+        <w:tab w:val="right" w:pos="9360"/>
+      </w:tabs>
+    </w:pPr>
+  </w:style>
+  <w:style w:type="character" w:customStyle="1" w:styleId="FooterChar">
+    <w:name w:val="Footer Char"/>
+    <w:basedOn w:val="DefaultParagraphFont"/>
+    <w:link w:val="Footer"/>
+    <w:uiPriority w:val="99"/>
+    <w:rsid w:val="004A4202"/>
+  </w:style>
 </w:styles>
 </file>
 

</xml_diff>